<commit_message>
feat(tx): expand model H/S C/T and set 8pt font in templates (#60)
Expand transformer model aliases (H/S to HERMETICALLY SEAL, C/T to CONSERVATOR TANK) across quick and full report domain models and render contexts. Set 8pt font size for {{ tx.model }} in all 12 templates.

Closes #60
</commit_message>
<xml_diff>
--- a/templates/FULL REPORT/NORMAL IR US TEV/tx-hv-sides.docx
+++ b/templates/FULL REPORT/NORMAL IR US TEV/tx-hv-sides.docx
@@ -388,13 +388,15 @@
               <w:ind w:left="139"/>
               <w:rPr>
                 <w:rFonts w:cstheme="minorHAnsi"/>
-                <w:sz w:val="14"/>
-                <w:szCs w:val="14"/>
-              </w:rPr>
-            </w:pPr>
-            <w:r>
-              <w:rPr>
-                <w:rFonts w:cstheme="minorHAnsi"/>
+                <w:sz w:val="16"/>
+                <w:szCs w:val="16"/>
+              </w:rPr>
+            </w:pPr>
+            <w:r>
+              <w:rPr>
+                <w:rFonts w:cstheme="minorHAnsi"/>
+                <w:sz w:val="16"/>
+                <w:szCs w:val="16"/>
               </w:rPr>
               <w:t>{{ tx.model }}</w:t>
             </w:r>

</xml_diff>